<commit_message>
pp-salygos: šablonai - DPS LT/EN priedų sąraše „Annex 7“ prie 6-o priedo -> „Annex 6“, antraštė „ANEXXES“ -> „ANNEXES“
sablonu-taisymai.py: numeris - pagal to paties sąrašo lietuvišką eilutę („6 priedas – Sandorio
šalies ...“); pridėjus 7 priedą angliškai būtų buvę du „Annex 7“. Žemėlapio tekstai suderinti.
Pakartotinai - 0 pakeitimų.

Co-Authored-By: Claude Opus 5.5 <noreply@anthropic.com>
</commit_message>
<xml_diff>
--- a/PP-salygos/templates/DPSP_LTEN_SALYGOS.docx
+++ b/PP-salygos/templates/DPSP_LTEN_SALYGOS.docx
@@ -26604,7 +26604,7 @@
                 <w:bCs/>
                 <w:color w:val="000000" w:themeColor="text1"/>
               </w:rPr>
-              <w:t>ANEXXES</w:t>
+              <w:t>ANNEXES</w:t>
             </w:r>
           </w:p>
         </w:tc>
@@ -27158,7 +27158,7 @@
                 <w:color w:val="FF0000"/>
                 <w:lang w:val="en-GB"/>
               </w:rPr>
-              <w:t xml:space="preserve">Annex 7 – Counterparty and/or Sub-Supplier Data form </w:t>
+              <w:t xml:space="preserve">Annex 6 – Counterparty and/or Sub-Supplier Data form </w:t>
             </w:r>
             <w:r>
               <w:rPr>

</xml_diff>